<commit_message>
Complete advanced Docker assignment with security, networking, volumes and CI/CD"
</commit_message>
<xml_diff>
--- a/Documentation.docx
+++ b/Documentation.docx
@@ -4,87 +4,1089 @@
   <w:body>
     <w:p>
       <w:pPr>
-        <w:rPr>
-          <w:b/>
-          <w:bCs/>
+        <w:pStyle w:val="Title"/>
+        <w:jc w:val="center"/>
+        <w:rPr>
+          <w:b/>
+          <w:bCs/>
+          <w:color w:val="0F4761" w:themeColor="accent1" w:themeShade="BF"/>
+          <w:spacing w:val="0"/>
+          <w:kern w:val="0"/>
+          <w:sz w:val="48"/>
+          <w:szCs w:val="48"/>
+          <w:lang w:val="en-US"/>
+          <w14:ligatures w14:val="none"/>
+        </w:rPr>
+      </w:pPr>
+      <w:r>
+        <w:rPr>
+          <w:b/>
+          <w:bCs/>
+          <w:color w:val="0F4761" w:themeColor="accent1" w:themeShade="BF"/>
+          <w:spacing w:val="0"/>
+          <w:kern w:val="0"/>
+          <w:sz w:val="48"/>
+          <w:szCs w:val="48"/>
+          <w:lang w:val="en-US"/>
+          <w14:ligatures w14:val="none"/>
+        </w:rPr>
+        <w:t>Advanced Docker Assignment Documentation</w:t>
+      </w:r>
+    </w:p>
+    <w:p>
+      <w:r>
+        <w:rPr>
+          <w:noProof/>
+          <w14:ligatures w14:val="standardContextual"/>
+        </w:rPr>
+        <mc:AlternateContent>
+          <mc:Choice Requires="wps">
+            <w:drawing>
+              <wp:anchor distT="0" distB="0" distL="114300" distR="114300" simplePos="0" relativeHeight="251659264" behindDoc="0" locked="0" layoutInCell="1" allowOverlap="1" wp14:anchorId="4B02CD4D" wp14:editId="0C504E23">
+                <wp:simplePos x="0" y="0"/>
+                <wp:positionH relativeFrom="column">
+                  <wp:posOffset>-38100</wp:posOffset>
+                </wp:positionH>
+                <wp:positionV relativeFrom="paragraph">
+                  <wp:posOffset>-1270</wp:posOffset>
+                </wp:positionV>
+                <wp:extent cx="6311900" cy="44450"/>
+                <wp:effectExtent l="0" t="0" r="31750" b="31750"/>
+                <wp:wrapNone/>
+                <wp:docPr id="437683618" name="Straight Connector 1"/>
+                <wp:cNvGraphicFramePr/>
+                <a:graphic xmlns:a="http://schemas.openxmlformats.org/drawingml/2006/main">
+                  <a:graphicData uri="http://schemas.microsoft.com/office/word/2010/wordprocessingShape">
+                    <wps:wsp>
+                      <wps:cNvCnPr/>
+                      <wps:spPr>
+                        <a:xfrm flipV="1">
+                          <a:off x="0" y="0"/>
+                          <a:ext cx="6311900" cy="44450"/>
+                        </a:xfrm>
+                        <a:prstGeom prst="line">
+                          <a:avLst/>
+                        </a:prstGeom>
+                      </wps:spPr>
+                      <wps:style>
+                        <a:lnRef idx="2">
+                          <a:schemeClr val="accent1"/>
+                        </a:lnRef>
+                        <a:fillRef idx="0">
+                          <a:schemeClr val="accent1"/>
+                        </a:fillRef>
+                        <a:effectRef idx="1">
+                          <a:schemeClr val="accent1"/>
+                        </a:effectRef>
+                        <a:fontRef idx="minor">
+                          <a:schemeClr val="tx1"/>
+                        </a:fontRef>
+                      </wps:style>
+                      <wps:bodyPr/>
+                    </wps:wsp>
+                  </a:graphicData>
+                </a:graphic>
+              </wp:anchor>
+            </w:drawing>
+          </mc:Choice>
+          <mc:Fallback>
+            <w:pict>
+              <v:line w14:anchorId="4DDEE360" id="Straight Connector 1" o:spid="_x0000_s1026" style="position:absolute;flip:y;z-index:251659264;visibility:visible;mso-wrap-style:square;mso-wrap-distance-left:9pt;mso-wrap-distance-top:0;mso-wrap-distance-right:9pt;mso-wrap-distance-bottom:0;mso-position-horizontal:absolute;mso-position-horizontal-relative:text;mso-position-vertical:absolute;mso-position-vertical-relative:text" from="-3pt,-.1pt" to="494pt,3.4pt" o:gfxdata="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" strokecolor="#156082 [3204]" strokeweight="1.5pt">
+                <v:stroke joinstyle="miter"/>
+              </v:line>
+            </w:pict>
+          </mc:Fallback>
+        </mc:AlternateContent>
+      </w:r>
+    </w:p>
+    <w:p>
+      <w:pPr>
+        <w:rPr>
+          <w:sz w:val="20"/>
+          <w:szCs w:val="20"/>
+        </w:rPr>
+      </w:pPr>
+      <w:r>
+        <w:rPr>
+          <w:sz w:val="20"/>
+          <w:szCs w:val="20"/>
+        </w:rPr>
+        <w:t xml:space="preserve">Project Name: </w:t>
+      </w:r>
+      <w:proofErr w:type="spellStart"/>
+      <w:r>
+        <w:rPr>
+          <w:sz w:val="20"/>
+          <w:szCs w:val="20"/>
+        </w:rPr>
+        <w:t>DockerDemoApp</w:t>
+      </w:r>
+      <w:proofErr w:type="spellEnd"/>
+      <w:r>
+        <w:rPr>
+          <w:sz w:val="20"/>
+          <w:szCs w:val="20"/>
+        </w:rPr>
+        <w:br/>
+        <w:t>Technology Stack: ASP.NET Core 8, PostgreSQL, Docker, Docker Compose</w:t>
+      </w:r>
+      <w:r>
+        <w:rPr>
+          <w:sz w:val="20"/>
+          <w:szCs w:val="20"/>
+        </w:rPr>
+        <w:br/>
+      </w:r>
+      <w:r>
+        <w:rPr>
+          <w:sz w:val="20"/>
+          <w:szCs w:val="20"/>
+        </w:rPr>
+        <w:br/>
+        <w:t>Objective:</w:t>
+      </w:r>
+      <w:r>
+        <w:rPr>
+          <w:sz w:val="20"/>
+          <w:szCs w:val="20"/>
+        </w:rPr>
+        <w:br/>
+        <w:t xml:space="preserve">Build a production-oriented multi-container </w:t>
+      </w:r>
+      <w:proofErr w:type="spellStart"/>
+      <w:r>
+        <w:rPr>
+          <w:sz w:val="20"/>
+          <w:szCs w:val="20"/>
+        </w:rPr>
+        <w:t>Dockerized</w:t>
+      </w:r>
+      <w:proofErr w:type="spellEnd"/>
+      <w:r>
+        <w:rPr>
+          <w:sz w:val="20"/>
+          <w:szCs w:val="20"/>
+        </w:rPr>
+        <w:t xml:space="preserve"> application while implementing advanced Docker concepts including networking, volumes, security, backup/restore, </w:t>
+      </w:r>
+      <w:proofErr w:type="spellStart"/>
+      <w:r>
+        <w:rPr>
+          <w:sz w:val="20"/>
+          <w:szCs w:val="20"/>
+        </w:rPr>
+        <w:t>DevSecOps</w:t>
+      </w:r>
+      <w:proofErr w:type="spellEnd"/>
+      <w:r>
+        <w:rPr>
+          <w:sz w:val="20"/>
+          <w:szCs w:val="20"/>
+        </w:rPr>
+        <w:t>, and CI/CD practices.</w:t>
+      </w:r>
+    </w:p>
+    <w:p>
+      <w:pPr>
+        <w:pStyle w:val="Heading1"/>
+        <w:spacing w:before="480" w:after="0" w:line="276" w:lineRule="auto"/>
+        <w:rPr>
+          <w:b/>
+          <w:bCs/>
+          <w:kern w:val="0"/>
+          <w:sz w:val="28"/>
+          <w:szCs w:val="28"/>
+          <w:lang w:val="en-US"/>
+          <w14:ligatures w14:val="none"/>
+        </w:rPr>
+      </w:pPr>
+      <w:proofErr w:type="spellStart"/>
+      <w:r>
+        <w:rPr>
+          <w:b/>
+          <w:bCs/>
+          <w:kern w:val="0"/>
+          <w:sz w:val="28"/>
+          <w:szCs w:val="28"/>
+          <w:lang w:val="en-US"/>
+          <w14:ligatures w14:val="none"/>
+        </w:rPr>
+        <w:t>Dockerfile</w:t>
+      </w:r>
+      <w:proofErr w:type="spellEnd"/>
+      <w:r>
+        <w:rPr>
+          <w:b/>
+          <w:bCs/>
+          <w:kern w:val="0"/>
+          <w:sz w:val="28"/>
+          <w:szCs w:val="28"/>
+          <w:lang w:val="en-US"/>
+          <w14:ligatures w14:val="none"/>
+        </w:rPr>
+        <w:t xml:space="preserve"> Optimization</w:t>
+      </w:r>
+    </w:p>
+    <w:p>
+      <w:pPr>
+        <w:rPr>
+          <w:sz w:val="20"/>
+          <w:szCs w:val="20"/>
+        </w:rPr>
+      </w:pPr>
+      <w:r>
+        <w:rPr>
+          <w:sz w:val="20"/>
+          <w:szCs w:val="20"/>
+        </w:rPr>
+        <w:t>Implemented multi-stage Docker builds, layer caching, runtime optimization, non-root container execution, and image size reduction techniques.</w:t>
+      </w:r>
+    </w:p>
+    <w:p>
+      <w:pPr>
+        <w:pStyle w:val="Heading1"/>
+        <w:spacing w:before="480" w:after="0" w:line="276" w:lineRule="auto"/>
+        <w:rPr>
+          <w:b/>
+          <w:bCs/>
+          <w:kern w:val="0"/>
+          <w:sz w:val="28"/>
+          <w:szCs w:val="28"/>
+          <w:lang w:val="en-US"/>
+          <w14:ligatures w14:val="none"/>
+        </w:rPr>
+      </w:pPr>
+      <w:r>
+        <w:rPr>
+          <w:b/>
+          <w:bCs/>
+          <w:kern w:val="0"/>
+          <w:sz w:val="28"/>
+          <w:szCs w:val="28"/>
+          <w:lang w:val="en-US"/>
+          <w14:ligatures w14:val="none"/>
+        </w:rPr>
+        <w:t>Multi-Stage Builds</w:t>
+      </w:r>
+    </w:p>
+    <w:p>
+      <w:pPr>
+        <w:rPr>
+          <w:sz w:val="20"/>
+          <w:szCs w:val="20"/>
+        </w:rPr>
+      </w:pPr>
+      <w:r>
+        <w:rPr>
+          <w:sz w:val="20"/>
+          <w:szCs w:val="20"/>
+        </w:rPr>
+        <w:t>Used separate SDK and runtime images to reduce final image size and improve security.</w:t>
+      </w:r>
+    </w:p>
+    <w:p>
+      <w:pPr>
+        <w:pStyle w:val="Heading1"/>
+        <w:spacing w:before="480" w:after="0" w:line="276" w:lineRule="auto"/>
+        <w:rPr>
+          <w:b/>
+          <w:bCs/>
+          <w:kern w:val="0"/>
+          <w:sz w:val="28"/>
+          <w:szCs w:val="28"/>
+          <w:lang w:val="en-US"/>
+          <w14:ligatures w14:val="none"/>
+        </w:rPr>
+      </w:pPr>
+      <w:r>
+        <w:rPr>
+          <w:b/>
+          <w:bCs/>
+          <w:kern w:val="0"/>
+          <w:sz w:val="28"/>
+          <w:szCs w:val="28"/>
+          <w:lang w:val="en-US"/>
+          <w14:ligatures w14:val="none"/>
+        </w:rPr>
+        <w:t>Docker Networking</w:t>
+      </w:r>
+    </w:p>
+    <w:p>
+      <w:pPr>
+        <w:rPr>
+          <w:sz w:val="20"/>
+          <w:szCs w:val="20"/>
+        </w:rPr>
+      </w:pPr>
+      <w:r>
+        <w:rPr>
+          <w:sz w:val="20"/>
+          <w:szCs w:val="20"/>
+        </w:rPr>
+        <w:t>Created custom Docker bridge network 'app-network' to enable isolated communication between ASP.NET Core and PostgreSQL containers.</w:t>
+      </w:r>
+    </w:p>
+    <w:p>
+      <w:pPr>
+        <w:pStyle w:val="Heading1"/>
+        <w:rPr>
+          <w:b/>
+          <w:bCs/>
+          <w:sz w:val="28"/>
+          <w:szCs w:val="28"/>
+        </w:rPr>
+      </w:pPr>
+      <w:r>
+        <w:rPr>
+          <w:b/>
+          <w:bCs/>
+          <w:sz w:val="28"/>
+          <w:szCs w:val="28"/>
+        </w:rPr>
+        <w:t>Network Inspection</w:t>
+      </w:r>
+    </w:p>
+    <w:p>
+      <w:pPr>
+        <w:rPr>
+          <w:sz w:val="20"/>
+          <w:szCs w:val="20"/>
+        </w:rPr>
+      </w:pPr>
+      <w:r>
+        <w:rPr>
+          <w:sz w:val="20"/>
+          <w:szCs w:val="20"/>
+        </w:rPr>
+        <w:t>Used Docker commands like docker network ls and docker network inspect app-network to inspect and manage networking configuration.</w:t>
+      </w:r>
+    </w:p>
+    <w:p>
+      <w:pPr>
+        <w:pStyle w:val="Heading1"/>
+        <w:rPr>
+          <w:b/>
+          <w:bCs/>
+          <w:sz w:val="28"/>
+          <w:szCs w:val="28"/>
+        </w:rPr>
+      </w:pPr>
+      <w:r>
+        <w:rPr>
+          <w:b/>
+          <w:bCs/>
+          <w:sz w:val="28"/>
+          <w:szCs w:val="28"/>
+        </w:rPr>
+        <w:t>Docker Volumes</w:t>
+      </w:r>
+    </w:p>
+    <w:p>
+      <w:pPr>
+        <w:rPr>
+          <w:sz w:val="20"/>
+          <w:szCs w:val="20"/>
+        </w:rPr>
+      </w:pPr>
+      <w:r>
+        <w:rPr>
+          <w:sz w:val="20"/>
+          <w:szCs w:val="20"/>
+        </w:rPr>
+        <w:t>Configured named Docker volume '</w:t>
+      </w:r>
+      <w:proofErr w:type="spellStart"/>
+      <w:r>
+        <w:rPr>
+          <w:sz w:val="20"/>
+          <w:szCs w:val="20"/>
+        </w:rPr>
+        <w:t>postgres</w:t>
+      </w:r>
+      <w:proofErr w:type="spellEnd"/>
+      <w:r>
+        <w:rPr>
+          <w:sz w:val="20"/>
+          <w:szCs w:val="20"/>
+        </w:rPr>
+        <w:t>-data' for PostgreSQL persistence.</w:t>
+      </w:r>
+    </w:p>
+    <w:p>
+      <w:pPr>
+        <w:pStyle w:val="Heading1"/>
+        <w:rPr>
+          <w:b/>
+          <w:bCs/>
+          <w:sz w:val="28"/>
+          <w:szCs w:val="28"/>
+        </w:rPr>
+      </w:pPr>
+      <w:r>
+        <w:rPr>
+          <w:b/>
+          <w:bCs/>
+          <w:sz w:val="28"/>
+          <w:szCs w:val="28"/>
+        </w:rPr>
+        <w:t>Bind Mounts</w:t>
+      </w:r>
+    </w:p>
+    <w:p>
+      <w:pPr>
+        <w:rPr>
+          <w:sz w:val="20"/>
+          <w:szCs w:val="20"/>
+        </w:rPr>
+      </w:pPr>
+      <w:r>
+        <w:rPr>
+          <w:sz w:val="20"/>
+          <w:szCs w:val="20"/>
+        </w:rPr>
+        <w:t>Configured bind mounts to store logs outside the container using /</w:t>
+      </w:r>
+      <w:proofErr w:type="spellStart"/>
+      <w:r>
+        <w:rPr>
+          <w:sz w:val="20"/>
+          <w:szCs w:val="20"/>
+        </w:rPr>
+        <w:t>mnt</w:t>
+      </w:r>
+      <w:proofErr w:type="spellEnd"/>
+      <w:r>
+        <w:rPr>
+          <w:sz w:val="20"/>
+          <w:szCs w:val="20"/>
+        </w:rPr>
+        <w:t>/c/Docker/logs:/app/logs.</w:t>
+      </w:r>
+    </w:p>
+    <w:p>
+      <w:pPr>
+        <w:pStyle w:val="Heading1"/>
+        <w:rPr>
+          <w:b/>
+          <w:bCs/>
+          <w:sz w:val="28"/>
+          <w:szCs w:val="28"/>
+        </w:rPr>
+      </w:pPr>
+      <w:r>
+        <w:rPr>
+          <w:b/>
+          <w:bCs/>
+          <w:sz w:val="28"/>
+          <w:szCs w:val="28"/>
+        </w:rPr>
+        <w:t>Backup and Restore</w:t>
+      </w:r>
+    </w:p>
+    <w:p>
+      <w:pPr>
+        <w:rPr>
+          <w:sz w:val="20"/>
+          <w:szCs w:val="20"/>
+        </w:rPr>
+      </w:pPr>
+      <w:r>
+        <w:rPr>
+          <w:sz w:val="20"/>
+          <w:szCs w:val="20"/>
+        </w:rPr>
+        <w:t>Performed Docker volume backup and restore operations using tar-based backup strategy.</w:t>
+      </w:r>
+    </w:p>
+    <w:p>
+      <w:pPr>
+        <w:pStyle w:val="Heading1"/>
+        <w:rPr>
+          <w:b/>
+          <w:bCs/>
+          <w:sz w:val="28"/>
+          <w:szCs w:val="28"/>
+        </w:rPr>
+      </w:pPr>
+      <w:r>
+        <w:rPr>
+          <w:b/>
+          <w:bCs/>
+          <w:sz w:val="28"/>
+          <w:szCs w:val="28"/>
+        </w:rPr>
+        <w:lastRenderedPageBreak/>
+        <w:t>Secret Management</w:t>
+      </w:r>
+    </w:p>
+    <w:p>
+      <w:pPr>
+        <w:rPr>
+          <w:sz w:val="20"/>
+          <w:szCs w:val="20"/>
+        </w:rPr>
+      </w:pPr>
+      <w:r>
+        <w:rPr>
+          <w:sz w:val="20"/>
+          <w:szCs w:val="20"/>
+        </w:rPr>
+        <w:t>Implemented Docker secrets using db_password.txt instead of hardcoded passwords.</w:t>
+      </w:r>
+    </w:p>
+    <w:p>
+      <w:pPr>
+        <w:pStyle w:val="Heading1"/>
+        <w:rPr>
+          <w:b/>
+          <w:bCs/>
+          <w:sz w:val="28"/>
+          <w:szCs w:val="28"/>
+        </w:rPr>
+      </w:pPr>
+      <w:r>
+        <w:rPr>
+          <w:b/>
+          <w:bCs/>
+          <w:sz w:val="28"/>
+          <w:szCs w:val="28"/>
+        </w:rPr>
+        <w:t>Least Privilege</w:t>
+      </w:r>
+    </w:p>
+    <w:p>
+      <w:pPr>
+        <w:rPr>
+          <w:sz w:val="20"/>
+          <w:szCs w:val="20"/>
+        </w:rPr>
+      </w:pPr>
+      <w:r>
+        <w:rPr>
+          <w:sz w:val="20"/>
+          <w:szCs w:val="20"/>
+        </w:rPr>
+        <w:t>Configured container to run using non-root user '</w:t>
+      </w:r>
+      <w:proofErr w:type="spellStart"/>
+      <w:r>
+        <w:rPr>
+          <w:sz w:val="20"/>
+          <w:szCs w:val="20"/>
+        </w:rPr>
+        <w:t>appuser</w:t>
+      </w:r>
+      <w:proofErr w:type="spellEnd"/>
+      <w:r>
+        <w:rPr>
+          <w:sz w:val="20"/>
+          <w:szCs w:val="20"/>
+        </w:rPr>
+        <w:t>' for enhanced security.</w:t>
+      </w:r>
+    </w:p>
+    <w:p>
+      <w:pPr>
+        <w:pStyle w:val="Heading1"/>
+        <w:rPr>
+          <w:b/>
+          <w:bCs/>
+          <w:sz w:val="28"/>
+          <w:szCs w:val="28"/>
+        </w:rPr>
+      </w:pPr>
+      <w:r>
+        <w:rPr>
+          <w:b/>
+          <w:bCs/>
+          <w:sz w:val="28"/>
+          <w:szCs w:val="28"/>
+        </w:rPr>
+        <w:t>Health Checks</w:t>
+      </w:r>
+    </w:p>
+    <w:p>
+      <w:pPr>
+        <w:rPr>
+          <w:sz w:val="20"/>
+          <w:szCs w:val="20"/>
+        </w:rPr>
+      </w:pPr>
+      <w:r>
+        <w:rPr>
+          <w:sz w:val="20"/>
+          <w:szCs w:val="20"/>
+        </w:rPr>
+        <w:t>Implemented Docker health checks using curl to monitor API availability.</w:t>
+      </w:r>
+    </w:p>
+    <w:p>
+      <w:pPr>
+        <w:pStyle w:val="Heading1"/>
+        <w:rPr>
+          <w:b/>
+          <w:bCs/>
+          <w:sz w:val="28"/>
+          <w:szCs w:val="28"/>
+        </w:rPr>
+      </w:pPr>
+      <w:r>
+        <w:rPr>
+          <w:b/>
+          <w:bCs/>
+          <w:sz w:val="28"/>
+          <w:szCs w:val="28"/>
+        </w:rPr>
+        <w:t>Restart Policies</w:t>
+      </w:r>
+    </w:p>
+    <w:p>
+      <w:pPr>
+        <w:rPr>
+          <w:sz w:val="20"/>
+          <w:szCs w:val="20"/>
+        </w:rPr>
+      </w:pPr>
+      <w:r>
+        <w:rPr>
+          <w:sz w:val="20"/>
+          <w:szCs w:val="20"/>
+        </w:rPr>
+        <w:t>Configured restart: unless-stopped for automatic recovery after crashes or restarts.</w:t>
+      </w:r>
+    </w:p>
+    <w:p>
+      <w:pPr>
+        <w:pStyle w:val="Heading1"/>
+        <w:rPr>
+          <w:b/>
+          <w:bCs/>
+          <w:sz w:val="28"/>
+          <w:szCs w:val="28"/>
+        </w:rPr>
+      </w:pPr>
+      <w:r>
+        <w:rPr>
+          <w:b/>
+          <w:bCs/>
+          <w:sz w:val="28"/>
+          <w:szCs w:val="28"/>
+        </w:rPr>
+        <w:t>Resource Limits</w:t>
+      </w:r>
+    </w:p>
+    <w:p>
+      <w:pPr>
+        <w:rPr>
+          <w:sz w:val="20"/>
+          <w:szCs w:val="20"/>
+        </w:rPr>
+      </w:pPr>
+      <w:r>
+        <w:rPr>
+          <w:sz w:val="20"/>
+          <w:szCs w:val="20"/>
+        </w:rPr>
+        <w:t>Configured memory limits for containers to prevent excessive resource usage.</w:t>
+      </w:r>
+    </w:p>
+    <w:p>
+      <w:pPr>
+        <w:pStyle w:val="Heading1"/>
+        <w:rPr>
+          <w:b/>
+          <w:bCs/>
+          <w:sz w:val="28"/>
+          <w:szCs w:val="28"/>
+        </w:rPr>
+      </w:pPr>
+      <w:r>
+        <w:rPr>
+          <w:b/>
+          <w:bCs/>
+          <w:sz w:val="28"/>
+          <w:szCs w:val="28"/>
+        </w:rPr>
+        <w:t>Vulnerability Scanning</w:t>
+      </w:r>
+    </w:p>
+    <w:p>
+      <w:pPr>
+        <w:rPr>
+          <w:sz w:val="20"/>
+          <w:szCs w:val="20"/>
+        </w:rPr>
+      </w:pPr>
+      <w:r>
+        <w:rPr>
+          <w:sz w:val="20"/>
+          <w:szCs w:val="20"/>
+        </w:rPr>
+        <w:t xml:space="preserve">Used </w:t>
+      </w:r>
+      <w:proofErr w:type="spellStart"/>
+      <w:r>
+        <w:rPr>
+          <w:sz w:val="20"/>
+          <w:szCs w:val="20"/>
+        </w:rPr>
+        <w:t>Trivy</w:t>
+      </w:r>
+      <w:proofErr w:type="spellEnd"/>
+      <w:r>
+        <w:rPr>
+          <w:sz w:val="20"/>
+          <w:szCs w:val="20"/>
+        </w:rPr>
+        <w:t xml:space="preserve"> to scan Docker images for vulnerabilities and insecure packages.</w:t>
+      </w:r>
+    </w:p>
+    <w:p>
+      <w:pPr>
+        <w:pStyle w:val="Heading1"/>
+        <w:rPr>
+          <w:b/>
+          <w:bCs/>
+          <w:sz w:val="28"/>
+          <w:szCs w:val="28"/>
+        </w:rPr>
+      </w:pPr>
+      <w:r>
+        <w:rPr>
+          <w:b/>
+          <w:bCs/>
+          <w:sz w:val="28"/>
+          <w:szCs w:val="28"/>
+        </w:rPr>
+        <w:t>Docker Bench Security</w:t>
+      </w:r>
+    </w:p>
+    <w:p>
+      <w:pPr>
+        <w:rPr>
+          <w:sz w:val="20"/>
+          <w:szCs w:val="20"/>
+        </w:rPr>
+      </w:pPr>
+      <w:r>
+        <w:rPr>
+          <w:sz w:val="20"/>
+          <w:szCs w:val="20"/>
+        </w:rPr>
+        <w:t>Audited Docker environment using Docker Bench Security to validate security posture.</w:t>
+      </w:r>
+    </w:p>
+    <w:p>
+      <w:pPr>
+        <w:pStyle w:val="Heading1"/>
+        <w:rPr>
+          <w:b/>
+          <w:bCs/>
+          <w:sz w:val="28"/>
+          <w:szCs w:val="28"/>
+        </w:rPr>
+      </w:pPr>
+      <w:r>
+        <w:rPr>
+          <w:b/>
+          <w:bCs/>
+          <w:sz w:val="28"/>
+          <w:szCs w:val="28"/>
+        </w:rPr>
+        <w:t>CI/CD Pipeline</w:t>
+      </w:r>
+    </w:p>
+    <w:p>
+      <w:pPr>
+        <w:rPr>
+          <w:sz w:val="20"/>
+          <w:szCs w:val="20"/>
+        </w:rPr>
+      </w:pPr>
+      <w:r>
+        <w:rPr>
+          <w:sz w:val="20"/>
+          <w:szCs w:val="20"/>
+        </w:rPr>
+        <w:t>Implemented GitHub Actions workflow for automated build, Docker image creation, and deployment pipeline.</w:t>
+      </w:r>
+    </w:p>
+    <w:p>
+      <w:pPr>
+        <w:pStyle w:val="Heading1"/>
+        <w:rPr>
+          <w:b/>
+          <w:bCs/>
+          <w:sz w:val="28"/>
+          <w:szCs w:val="28"/>
+        </w:rPr>
+      </w:pPr>
+      <w:r>
+        <w:rPr>
+          <w:b/>
+          <w:bCs/>
+          <w:sz w:val="28"/>
+          <w:szCs w:val="28"/>
+        </w:rPr>
+        <w:t>Architecture</w:t>
+      </w:r>
+    </w:p>
+    <w:p>
+      <w:pPr>
+        <w:rPr>
+          <w:sz w:val="20"/>
+          <w:szCs w:val="20"/>
+        </w:rPr>
+      </w:pPr>
+      <w:r>
+        <w:rPr>
+          <w:sz w:val="20"/>
+          <w:szCs w:val="20"/>
+        </w:rPr>
+        <w:t xml:space="preserve">The project uses </w:t>
+      </w:r>
+      <w:proofErr w:type="gramStart"/>
+      <w:r>
+        <w:rPr>
+          <w:sz w:val="20"/>
+          <w:szCs w:val="20"/>
+        </w:rPr>
+        <w:t>a multi</w:t>
+      </w:r>
+      <w:proofErr w:type="gramEnd"/>
+      <w:r>
+        <w:rPr>
+          <w:sz w:val="20"/>
+          <w:szCs w:val="20"/>
+        </w:rPr>
+        <w:t xml:space="preserve">-container Docker architecture consisting of an ASP.NET Core Web API container and a PostgreSQL database container connected through a custom Docker bridge network. The application is containerized using a multi-stage </w:t>
+      </w:r>
+      <w:proofErr w:type="spellStart"/>
+      <w:r>
+        <w:rPr>
+          <w:sz w:val="20"/>
+          <w:szCs w:val="20"/>
+        </w:rPr>
+        <w:t>Dockerfile</w:t>
+      </w:r>
+      <w:proofErr w:type="spellEnd"/>
+      <w:r>
+        <w:rPr>
+          <w:sz w:val="20"/>
+          <w:szCs w:val="20"/>
+        </w:rPr>
+        <w:t xml:space="preserve"> to optimize image size and build performance. Persistent data storage is achieved using Docker named volumes, while bind mounts are used for external log management. </w:t>
+      </w:r>
+      <w:proofErr w:type="gramStart"/>
+      <w:r>
+        <w:rPr>
+          <w:sz w:val="20"/>
+          <w:szCs w:val="20"/>
+        </w:rPr>
+        <w:t>Security best</w:t>
+      </w:r>
+      <w:proofErr w:type="gramEnd"/>
+      <w:r>
+        <w:rPr>
+          <w:sz w:val="20"/>
+          <w:szCs w:val="20"/>
+        </w:rPr>
+        <w:t xml:space="preserve"> practices such as non-root containers, Docker secrets, vulnerability scanning using </w:t>
+      </w:r>
+      <w:proofErr w:type="spellStart"/>
+      <w:r>
+        <w:rPr>
+          <w:sz w:val="20"/>
+          <w:szCs w:val="20"/>
+        </w:rPr>
+        <w:t>Trivy</w:t>
+      </w:r>
+      <w:proofErr w:type="spellEnd"/>
+      <w:r>
+        <w:rPr>
+          <w:sz w:val="20"/>
+          <w:szCs w:val="20"/>
+        </w:rPr>
+        <w:t>, and Docker Bench Security auditing were implemented to make the setup production-oriented and secure.</w:t>
+      </w:r>
+    </w:p>
+    <w:p>
+      <w:pPr>
+        <w:pStyle w:val="Heading1"/>
+        <w:rPr>
+          <w:b/>
+          <w:bCs/>
+          <w:sz w:val="28"/>
+          <w:szCs w:val="28"/>
+        </w:rPr>
+      </w:pPr>
+      <w:r>
+        <w:rPr>
+          <w:b/>
+          <w:bCs/>
+          <w:sz w:val="28"/>
+          <w:szCs w:val="28"/>
+        </w:rPr>
+        <w:lastRenderedPageBreak/>
+        <w:t>Assignment Requirement Mapping</w:t>
+      </w:r>
+    </w:p>
+    <w:p>
+      <w:pPr>
+        <w:rPr>
+          <w:sz w:val="20"/>
+          <w:szCs w:val="20"/>
+        </w:rPr>
+      </w:pPr>
+      <w:r>
+        <w:rPr>
+          <w:sz w:val="20"/>
+          <w:szCs w:val="20"/>
+        </w:rPr>
+        <w:t>All assignment requirements were successfully completed including optimization, networking, volumes, security, backup/restore, scanning, and production hardening.</w:t>
+      </w:r>
+    </w:p>
+    <w:p>
+      <w:pPr>
+        <w:pStyle w:val="Heading1"/>
+        <w:rPr>
+          <w:b/>
+          <w:bCs/>
+          <w:sz w:val="28"/>
+          <w:szCs w:val="28"/>
+        </w:rPr>
+      </w:pPr>
+      <w:r>
+        <w:rPr>
+          <w:b/>
+          <w:bCs/>
+          <w:sz w:val="28"/>
+          <w:szCs w:val="28"/>
+        </w:rPr>
+        <w:t>Learning Outcomes</w:t>
+      </w:r>
+    </w:p>
+    <w:p>
+      <w:pPr>
+        <w:rPr>
+          <w:sz w:val="20"/>
+          <w:szCs w:val="20"/>
+        </w:rPr>
+      </w:pPr>
+      <w:r>
+        <w:rPr>
+          <w:sz w:val="20"/>
+          <w:szCs w:val="20"/>
+        </w:rPr>
+        <w:t xml:space="preserve">Learned enterprise Docker concepts including containerization, networking, persistence, </w:t>
+      </w:r>
+      <w:proofErr w:type="spellStart"/>
+      <w:r>
+        <w:rPr>
+          <w:sz w:val="20"/>
+          <w:szCs w:val="20"/>
+        </w:rPr>
+        <w:t>DevSecOps</w:t>
+      </w:r>
+      <w:proofErr w:type="spellEnd"/>
+      <w:r>
+        <w:rPr>
+          <w:sz w:val="20"/>
+          <w:szCs w:val="20"/>
+        </w:rPr>
+        <w:t>, security hardening, CI/CD, and production-ready deployment practices.</w:t>
+      </w:r>
+    </w:p>
+    <w:p>
+      <w:pPr>
+        <w:pStyle w:val="Heading1"/>
+        <w:rPr>
+          <w:b/>
+          <w:bCs/>
+          <w:sz w:val="28"/>
+          <w:szCs w:val="28"/>
+        </w:rPr>
+      </w:pPr>
+      <w:r>
+        <w:rPr>
+          <w:b/>
+          <w:bCs/>
+          <w:sz w:val="28"/>
+          <w:szCs w:val="28"/>
+        </w:rPr>
+        <w:t>Conclusion</w:t>
+      </w:r>
+    </w:p>
+    <w:p>
+      <w:pPr>
+        <w:rPr>
+          <w:b/>
+          <w:bCs/>
+          <w:sz w:val="20"/>
+          <w:szCs w:val="20"/>
           <w:u w:val="single"/>
         </w:rPr>
       </w:pPr>
       <w:r>
         <w:rPr>
-          <w:b/>
-          <w:bCs/>
+          <w:sz w:val="20"/>
+          <w:szCs w:val="20"/>
+        </w:rPr>
+        <w:t xml:space="preserve">Successfully implemented an enterprise-style </w:t>
+      </w:r>
+      <w:proofErr w:type="spellStart"/>
+      <w:r>
+        <w:rPr>
+          <w:sz w:val="20"/>
+          <w:szCs w:val="20"/>
+        </w:rPr>
+        <w:t>Dockerized</w:t>
+      </w:r>
+      <w:proofErr w:type="spellEnd"/>
+      <w:r>
+        <w:rPr>
+          <w:sz w:val="20"/>
+          <w:szCs w:val="20"/>
+        </w:rPr>
+        <w:t xml:space="preserve"> ASP.NET Core application with PostgreSQL using advanced Docker concepts, security best practices, and </w:t>
+      </w:r>
+      <w:proofErr w:type="spellStart"/>
+      <w:r>
+        <w:rPr>
+          <w:sz w:val="20"/>
+          <w:szCs w:val="20"/>
+        </w:rPr>
+        <w:t>DevSecOps</w:t>
+      </w:r>
+      <w:proofErr w:type="spellEnd"/>
+      <w:r>
+        <w:rPr>
+          <w:sz w:val="20"/>
+          <w:szCs w:val="20"/>
+        </w:rPr>
+        <w:t xml:space="preserve"> tooling.</w:t>
+      </w:r>
+      <w:r>
+        <w:rPr>
+          <w:sz w:val="20"/>
+          <w:szCs w:val="20"/>
         </w:rPr>
         <w:br/>
       </w:r>
       <w:r>
         <w:rPr>
-          <w:b/>
-          <w:bCs/>
-          <w:u w:val="single"/>
-        </w:rPr>
-        <w:t>Docker architecture</w:t>
-      </w:r>
-    </w:p>
-    <w:p>
-      <w:pPr>
-        <w:rPr>
-          <w:sz w:val="20"/>
-          <w:szCs w:val="20"/>
-        </w:rPr>
-      </w:pPr>
-      <w:r>
-        <w:rPr>
-          <w:sz w:val="20"/>
-          <w:szCs w:val="20"/>
-        </w:rPr>
-        <w:t xml:space="preserve">The project uses a multi-container Docker architecture consisting of an ASP.NET Core Web API container and a PostgreSQL database container connected through a custom Docker bridge network. The application is containerized using a multi-stage </w:t>
-      </w:r>
-      <w:proofErr w:type="spellStart"/>
-      <w:r>
-        <w:rPr>
-          <w:sz w:val="20"/>
-          <w:szCs w:val="20"/>
-        </w:rPr>
-        <w:t>Dockerfile</w:t>
-      </w:r>
-      <w:proofErr w:type="spellEnd"/>
-      <w:r>
-        <w:rPr>
-          <w:sz w:val="20"/>
-          <w:szCs w:val="20"/>
-        </w:rPr>
-        <w:t xml:space="preserve"> to optimize image size and build performance. Persistent data storage is achieved using Docker named volumes, while bind mounts are used for external log management. Security best practices such as non-root containers, Docker secrets, vulnerability scanning using </w:t>
-      </w:r>
-      <w:proofErr w:type="spellStart"/>
-      <w:r>
-        <w:rPr>
-          <w:sz w:val="20"/>
-          <w:szCs w:val="20"/>
-        </w:rPr>
-        <w:t>Trivy</w:t>
-      </w:r>
-      <w:proofErr w:type="spellEnd"/>
-      <w:r>
-        <w:rPr>
-          <w:sz w:val="20"/>
-          <w:szCs w:val="20"/>
-        </w:rPr>
-        <w:t>, and Docker Bench Security auditing were implemented to make the setup production-oriented and secure.</w:t>
-      </w:r>
-    </w:p>
-    <w:p>
-      <w:pPr>
-        <w:rPr>
-          <w:sz w:val="20"/>
-          <w:szCs w:val="20"/>
-        </w:rPr>
-      </w:pPr>
-    </w:p>
+          <w:sz w:val="20"/>
+          <w:szCs w:val="20"/>
+        </w:rPr>
+        <w:br/>
+      </w:r>
+    </w:p>
+    <w:p/>
+    <w:p/>
     <w:sectPr>
-      <w:pgSz w:w="11906" w:h="16838"/>
-      <w:pgMar w:top="1440" w:right="1440" w:bottom="1440" w:left="1440" w:header="708" w:footer="708" w:gutter="0"/>
-      <w:cols w:space="708"/>
+      <w:pgSz w:w="12240" w:h="15840"/>
+      <w:pgMar w:top="1440" w:right="1800" w:bottom="1440" w:left="1800" w:header="720" w:footer="720" w:gutter="0"/>
+      <w:cols w:space="720"/>
       <w:docGrid w:linePitch="360"/>
     </w:sectPr>
   </w:body>
@@ -491,6 +1493,18 @@
   <w:style w:type="paragraph" w:default="1" w:styleId="Normal">
     <w:name w:val="Normal"/>
     <w:qFormat/>
+    <w:rsid w:val="005F0878"/>
+    <w:pPr>
+      <w:spacing w:after="200" w:line="276" w:lineRule="auto"/>
+    </w:pPr>
+    <w:rPr>
+      <w:rFonts w:eastAsiaTheme="minorEastAsia"/>
+      <w:kern w:val="0"/>
+      <w:sz w:val="22"/>
+      <w:szCs w:val="22"/>
+      <w:lang w:val="en-US"/>
+      <w14:ligatures w14:val="none"/>
+    </w:rPr>
   </w:style>
   <w:style w:type="paragraph" w:styleId="Heading1">
     <w:name w:val="heading 1"/>
@@ -503,14 +1517,17 @@
     <w:pPr>
       <w:keepNext/>
       <w:keepLines/>
-      <w:spacing w:before="360" w:after="80"/>
+      <w:spacing w:before="360" w:after="80" w:line="278" w:lineRule="auto"/>
       <w:outlineLvl w:val="0"/>
     </w:pPr>
     <w:rPr>
       <w:rFonts w:asciiTheme="majorHAnsi" w:eastAsiaTheme="majorEastAsia" w:hAnsiTheme="majorHAnsi" w:cstheme="majorBidi"/>
       <w:color w:val="0F4761" w:themeColor="accent1" w:themeShade="BF"/>
+      <w:kern w:val="2"/>
       <w:sz w:val="40"/>
       <w:szCs w:val="40"/>
+      <w:lang w:val="en-IN"/>
+      <w14:ligatures w14:val="standardContextual"/>
     </w:rPr>
   </w:style>
   <w:style w:type="paragraph" w:styleId="Heading2">
@@ -526,14 +1543,17 @@
     <w:pPr>
       <w:keepNext/>
       <w:keepLines/>
-      <w:spacing w:before="160" w:after="80"/>
+      <w:spacing w:before="160" w:after="80" w:line="278" w:lineRule="auto"/>
       <w:outlineLvl w:val="1"/>
     </w:pPr>
     <w:rPr>
       <w:rFonts w:asciiTheme="majorHAnsi" w:eastAsiaTheme="majorEastAsia" w:hAnsiTheme="majorHAnsi" w:cstheme="majorBidi"/>
       <w:color w:val="0F4761" w:themeColor="accent1" w:themeShade="BF"/>
+      <w:kern w:val="2"/>
       <w:sz w:val="32"/>
       <w:szCs w:val="32"/>
+      <w:lang w:val="en-IN"/>
+      <w14:ligatures w14:val="standardContextual"/>
     </w:rPr>
   </w:style>
   <w:style w:type="paragraph" w:styleId="Heading3">
@@ -549,14 +1569,17 @@
     <w:pPr>
       <w:keepNext/>
       <w:keepLines/>
-      <w:spacing w:before="160" w:after="80"/>
+      <w:spacing w:before="160" w:after="80" w:line="278" w:lineRule="auto"/>
       <w:outlineLvl w:val="2"/>
     </w:pPr>
     <w:rPr>
       <w:rFonts w:eastAsiaTheme="majorEastAsia" w:cstheme="majorBidi"/>
       <w:color w:val="0F4761" w:themeColor="accent1" w:themeShade="BF"/>
+      <w:kern w:val="2"/>
       <w:sz w:val="28"/>
       <w:szCs w:val="28"/>
+      <w:lang w:val="en-IN"/>
+      <w14:ligatures w14:val="standardContextual"/>
     </w:rPr>
   </w:style>
   <w:style w:type="paragraph" w:styleId="Heading4">
@@ -572,7 +1595,7 @@
     <w:pPr>
       <w:keepNext/>
       <w:keepLines/>
-      <w:spacing w:before="80" w:after="40"/>
+      <w:spacing w:before="80" w:after="40" w:line="278" w:lineRule="auto"/>
       <w:outlineLvl w:val="3"/>
     </w:pPr>
     <w:rPr>
@@ -580,6 +1603,11 @@
       <w:i/>
       <w:iCs/>
       <w:color w:val="0F4761" w:themeColor="accent1" w:themeShade="BF"/>
+      <w:kern w:val="2"/>
+      <w:sz w:val="24"/>
+      <w:szCs w:val="24"/>
+      <w:lang w:val="en-IN"/>
+      <w14:ligatures w14:val="standardContextual"/>
     </w:rPr>
   </w:style>
   <w:style w:type="paragraph" w:styleId="Heading5">
@@ -595,12 +1623,17 @@
     <w:pPr>
       <w:keepNext/>
       <w:keepLines/>
-      <w:spacing w:before="80" w:after="40"/>
+      <w:spacing w:before="80" w:after="40" w:line="278" w:lineRule="auto"/>
       <w:outlineLvl w:val="4"/>
     </w:pPr>
     <w:rPr>
       <w:rFonts w:eastAsiaTheme="majorEastAsia" w:cstheme="majorBidi"/>
       <w:color w:val="0F4761" w:themeColor="accent1" w:themeShade="BF"/>
+      <w:kern w:val="2"/>
+      <w:sz w:val="24"/>
+      <w:szCs w:val="24"/>
+      <w:lang w:val="en-IN"/>
+      <w14:ligatures w14:val="standardContextual"/>
     </w:rPr>
   </w:style>
   <w:style w:type="paragraph" w:styleId="Heading6">
@@ -616,7 +1649,7 @@
     <w:pPr>
       <w:keepNext/>
       <w:keepLines/>
-      <w:spacing w:before="40" w:after="0"/>
+      <w:spacing w:before="40" w:after="0" w:line="278" w:lineRule="auto"/>
       <w:outlineLvl w:val="5"/>
     </w:pPr>
     <w:rPr>
@@ -624,6 +1657,11 @@
       <w:i/>
       <w:iCs/>
       <w:color w:val="595959" w:themeColor="text1" w:themeTint="A6"/>
+      <w:kern w:val="2"/>
+      <w:sz w:val="24"/>
+      <w:szCs w:val="24"/>
+      <w:lang w:val="en-IN"/>
+      <w14:ligatures w14:val="standardContextual"/>
     </w:rPr>
   </w:style>
   <w:style w:type="paragraph" w:styleId="Heading7">
@@ -639,12 +1677,17 @@
     <w:pPr>
       <w:keepNext/>
       <w:keepLines/>
-      <w:spacing w:before="40" w:after="0"/>
+      <w:spacing w:before="40" w:after="0" w:line="278" w:lineRule="auto"/>
       <w:outlineLvl w:val="6"/>
     </w:pPr>
     <w:rPr>
       <w:rFonts w:eastAsiaTheme="majorEastAsia" w:cstheme="majorBidi"/>
       <w:color w:val="595959" w:themeColor="text1" w:themeTint="A6"/>
+      <w:kern w:val="2"/>
+      <w:sz w:val="24"/>
+      <w:szCs w:val="24"/>
+      <w:lang w:val="en-IN"/>
+      <w14:ligatures w14:val="standardContextual"/>
     </w:rPr>
   </w:style>
   <w:style w:type="paragraph" w:styleId="Heading8">
@@ -660,7 +1703,7 @@
     <w:pPr>
       <w:keepNext/>
       <w:keepLines/>
-      <w:spacing w:after="0"/>
+      <w:spacing w:after="0" w:line="278" w:lineRule="auto"/>
       <w:outlineLvl w:val="7"/>
     </w:pPr>
     <w:rPr>
@@ -668,6 +1711,11 @@
       <w:i/>
       <w:iCs/>
       <w:color w:val="272727" w:themeColor="text1" w:themeTint="D8"/>
+      <w:kern w:val="2"/>
+      <w:sz w:val="24"/>
+      <w:szCs w:val="24"/>
+      <w:lang w:val="en-IN"/>
+      <w14:ligatures w14:val="standardContextual"/>
     </w:rPr>
   </w:style>
   <w:style w:type="paragraph" w:styleId="Heading9">
@@ -683,17 +1731,23 @@
     <w:pPr>
       <w:keepNext/>
       <w:keepLines/>
-      <w:spacing w:after="0"/>
+      <w:spacing w:after="0" w:line="278" w:lineRule="auto"/>
       <w:outlineLvl w:val="8"/>
     </w:pPr>
     <w:rPr>
       <w:rFonts w:eastAsiaTheme="majorEastAsia" w:cstheme="majorBidi"/>
       <w:color w:val="272727" w:themeColor="text1" w:themeTint="D8"/>
+      <w:kern w:val="2"/>
+      <w:sz w:val="24"/>
+      <w:szCs w:val="24"/>
+      <w:lang w:val="en-IN"/>
+      <w14:ligatures w14:val="standardContextual"/>
     </w:rPr>
   </w:style>
   <w:style w:type="character" w:default="1" w:styleId="DefaultParagraphFont">
     <w:name w:val="Default Paragraph Font"/>
     <w:uiPriority w:val="1"/>
+    <w:semiHidden/>
     <w:unhideWhenUsed/>
   </w:style>
   <w:style w:type="table" w:default="1" w:styleId="TableNormal">
@@ -854,6 +1908,8 @@
       <w:kern w:val="28"/>
       <w:sz w:val="56"/>
       <w:szCs w:val="56"/>
+      <w:lang w:val="en-IN"/>
+      <w14:ligatures w14:val="standardContextual"/>
     </w:rPr>
   </w:style>
   <w:style w:type="character" w:customStyle="1" w:styleId="TitleChar">
@@ -882,13 +1938,17 @@
       <w:numPr>
         <w:ilvl w:val="1"/>
       </w:numPr>
+      <w:spacing w:after="160" w:line="278" w:lineRule="auto"/>
     </w:pPr>
     <w:rPr>
       <w:rFonts w:eastAsiaTheme="majorEastAsia" w:cstheme="majorBidi"/>
       <w:color w:val="595959" w:themeColor="text1" w:themeTint="A6"/>
       <w:spacing w:val="15"/>
+      <w:kern w:val="2"/>
       <w:sz w:val="28"/>
       <w:szCs w:val="28"/>
+      <w:lang w:val="en-IN"/>
+      <w14:ligatures w14:val="standardContextual"/>
     </w:rPr>
   </w:style>
   <w:style w:type="character" w:customStyle="1" w:styleId="SubtitleChar">
@@ -914,13 +1974,19 @@
     <w:qFormat/>
     <w:rsid w:val="006C4BC6"/>
     <w:pPr>
-      <w:spacing w:before="160"/>
+      <w:spacing w:before="160" w:after="160" w:line="278" w:lineRule="auto"/>
       <w:jc w:val="center"/>
     </w:pPr>
     <w:rPr>
+      <w:rFonts w:eastAsiaTheme="minorHAnsi"/>
       <w:i/>
       <w:iCs/>
       <w:color w:val="404040" w:themeColor="text1" w:themeTint="BF"/>
+      <w:kern w:val="2"/>
+      <w:sz w:val="24"/>
+      <w:szCs w:val="24"/>
+      <w:lang w:val="en-IN"/>
+      <w14:ligatures w14:val="standardContextual"/>
     </w:rPr>
   </w:style>
   <w:style w:type="character" w:customStyle="1" w:styleId="QuoteChar">
@@ -942,9 +2008,18 @@
     <w:qFormat/>
     <w:rsid w:val="006C4BC6"/>
     <w:pPr>
+      <w:spacing w:after="160" w:line="278" w:lineRule="auto"/>
       <w:ind w:left="720"/>
       <w:contextualSpacing/>
     </w:pPr>
+    <w:rPr>
+      <w:rFonts w:eastAsiaTheme="minorHAnsi"/>
+      <w:kern w:val="2"/>
+      <w:sz w:val="24"/>
+      <w:szCs w:val="24"/>
+      <w:lang w:val="en-IN"/>
+      <w14:ligatures w14:val="standardContextual"/>
+    </w:rPr>
   </w:style>
   <w:style w:type="character" w:styleId="IntenseEmphasis">
     <w:name w:val="Intense Emphasis"/>
@@ -971,14 +2046,20 @@
         <w:top w:val="single" w:sz="4" w:space="10" w:color="0F4761" w:themeColor="accent1" w:themeShade="BF"/>
         <w:bottom w:val="single" w:sz="4" w:space="10" w:color="0F4761" w:themeColor="accent1" w:themeShade="BF"/>
       </w:pBdr>
-      <w:spacing w:before="360" w:after="360"/>
+      <w:spacing w:before="360" w:after="360" w:line="278" w:lineRule="auto"/>
       <w:ind w:left="864" w:right="864"/>
       <w:jc w:val="center"/>
     </w:pPr>
     <w:rPr>
+      <w:rFonts w:eastAsiaTheme="minorHAnsi"/>
       <w:i/>
       <w:iCs/>
       <w:color w:val="0F4761" w:themeColor="accent1" w:themeShade="BF"/>
+      <w:kern w:val="2"/>
+      <w:sz w:val="24"/>
+      <w:szCs w:val="24"/>
+      <w:lang w:val="en-IN"/>
+      <w14:ligatures w14:val="standardContextual"/>
     </w:rPr>
   </w:style>
   <w:style w:type="character" w:customStyle="1" w:styleId="IntenseQuoteChar">

</xml_diff>